<commit_message>
chore: align bridle visualization with dynamic ODE solver, configuration independence, and gravity sag validation
- Aligned 3D gold bridle rendering with untilted dynamic shaft perp basis (matching rope_forces.jl physical equations) to resolve disappearing tension visual and telemetry skew.
- Replaced static segment-count indices with dynamic sys.n_ring - 1 for octagon v5 vs. 5-line configuration independence.
- Restored missing basis assignment in capture_frame.
- Added test_bearing_alignment.jl verifying correct physical bridle geometry and sagged tension distribution under gravity.
- Integrated accumulated spacer ring design module, pitch depower control campaigns, design reports, handovers, and figure updates.
</commit_message>
<xml_diff>
--- a/Lift_Kite_Sizing_Report.docx
+++ b/Lift_Kite_Sizing_Report.docx
@@ -7067,13 +7067,62 @@
         <w:spacing w:after="120"/>
       </w:pPr>
       <w:r>
+        <w:t>The rotary lifter with passive tip-speed governor is recommended. A detailed design phase should address start-up pre-spin and lateral force characterisation prior to prototype build. The Julia GLMakie 3D system rendering of the installed geometry is shown below in Figure 6.</w:t>
+      </w:r>
+    </w:p>
+    <w:p>
+      <w:pPr>
+        <w:jc w:val="center"/>
+      </w:pPr>
+      <w:r>
+        <w:drawing>
+          <wp:inline xmlns:a="http://schemas.openxmlformats.org/drawingml/2006/main" xmlns:pic="http://schemas.openxmlformats.org/drawingml/2006/picture">
+            <wp:extent cx="5303520" cy="3150291"/>
+            <wp:docPr id="6" name="Picture 6"/>
+            <wp:cNvGraphicFramePr>
+              <a:graphicFrameLocks noChangeAspect="1"/>
+            </wp:cNvGraphicFramePr>
+            <a:graphic>
+              <a:graphicData uri="http://schemas.openxmlformats.org/drawingml/2006/picture">
+                <pic:pic>
+                  <pic:nvPicPr>
+                    <pic:cNvPr id="0" name="fig_trpt_installed_geometry.png"/>
+                    <pic:cNvPicPr/>
+                  </pic:nvPicPr>
+                  <pic:blipFill>
+                    <a:blip r:embed="rId14"/>
+                    <a:stretch>
+                      <a:fillRect/>
+                    </a:stretch>
+                  </pic:blipFill>
+                  <pic:spPr>
+                    <a:xfrm>
+                      <a:off x="0" y="0"/>
+                      <a:ext cx="5303520" cy="3150291"/>
+                    </a:xfrm>
+                    <a:prstGeom prst="rect"/>
+                  </pic:spPr>
+                </pic:pic>
+              </a:graphicData>
+            </a:graphic>
+          </wp:inline>
+        </w:drawing>
+      </w:r>
+    </w:p>
+    <w:p>
+      <w:pPr>
+        <w:jc w:val="center"/>
+      </w:pPr>
+      <w:r>
         <w:rPr>
-          <w:b w:val="0"/>
-          <w:i w:val="0"/>
-          <w:sz w:val="22"/>
+          <w:i/>
+          <w:sz w:val="17"/>
         </w:rPr>
-        <w:t>The rotary lifter with passive tip-speed governor is recommended. A detailed design phase should address start-up pre-spin and lateral force characterisation prior to prototype build. A Julia GLMakie render of the installed geometry (with annotated dimensions) will be added to this section in a subsequent revision.</w:t>
+        <w:t>Figure 6: Julia GLMakie 3D system rendering of the installed 10 kW TRPT autogyro kite turbine system showing ground anchoring, the multi-ring TRPT transmission, and the rotary autogyro lifter.</w:t>
       </w:r>
+    </w:p>
+    <w:p>
+      <w:r/>
     </w:p>
     <w:p>
       <w:pPr>

</xml_diff>